<commit_message>
docs: expand AVA review pack for Monday
</commit_message>
<xml_diff>
--- a/docs/review-pack/AVA_Evaluation_Review_Report.docx
+++ b/docs/review-pack/AVA_Evaluation_Review_Report.docx
@@ -2656,6 +2656,458 @@
         <w:t>“AVA asks a practical question: when agents disagree about the same state key, what can be reconciled safely, what needs evidence, and what should remain unresolved? I will compare methods with explicit safety and usefulness measures, without assuming that more intelligent models perform better. The current contribution is a testable proposal; the novelty and convergence claims stay open until their gates are met.”</w:t>
       </w:r>
     </w:p>
+    <w:p>
+      <w:r>
+        <w:br w:type="page"/>
+      </w:r>
+    </w:p>
+    <w:p>
+      <w:pPr>
+        <w:pStyle w:val="Heading1"/>
+      </w:pPr>
+      <w:r>
+        <w:t>Review focus: why shared state matters in an AI-agent team</w:t>
+      </w:r>
+    </w:p>
+    <w:p>
+      <w:r>
+        <w:t xml:space="preserve">This is a hypothetical teaching scenario using the six labels exactly as supplied: </w:t>
+      </w:r>
+      <w:r>
+        <w:rPr>
+          <w:b/>
+        </w:rPr>
+        <w:t>Grok bot, GPT dots, Claude duet, Harkpro, Wajo Fo, Wabi</w:t>
+      </w:r>
+      <w:r>
+        <w:t>. These are labels only. No real capability, product identity, integration, role, or performance is being asserted.</w:t>
+      </w:r>
+    </w:p>
+    <w:p>
+      <w:r>
+        <w:t xml:space="preserve">Assume the six independently operating agents each emit a candidate value for the same explicitly declared key: </w:t>
+      </w:r>
+      <w:r>
+        <w:rPr>
+          <w:b/>
+        </w:rPr>
+        <w:t>service.demo-api.primary_db</w:t>
+      </w:r>
+      <w:r>
+        <w:t>. The key has type “database enum,” exactly-one cardinality, scope “demo-api,” and a shared current-release interval. Three hypothetical writes say PostgreSQL and three say DynamoDB. The example is constructed only to make the method easy to explain; it is not a real system trace or an experimental result.</w:t>
+      </w:r>
+    </w:p>
+    <w:p>
+      <w:pPr>
+        <w:jc w:val="center"/>
+      </w:pPr>
+      <w:r>
+        <w:drawing>
+          <wp:inline xmlns:a="http://schemas.openxmlformats.org/drawingml/2006/main" xmlns:pic="http://schemas.openxmlformats.org/drawingml/2006/picture">
+            <wp:extent cx="5989320" cy="3144393"/>
+            <wp:docPr id="7" name="Picture 7"/>
+            <wp:cNvGraphicFramePr>
+              <a:graphicFrameLocks noChangeAspect="1"/>
+            </wp:cNvGraphicFramePr>
+            <a:graphic>
+              <a:graphicData uri="http://schemas.openxmlformats.org/drawingml/2006/picture">
+                <pic:pic>
+                  <pic:nvPicPr>
+                    <pic:cNvPr id="0" name="hypothetical_agent_team.png"/>
+                    <pic:cNvPicPr/>
+                  </pic:nvPicPr>
+                  <pic:blipFill>
+                    <a:blip r:embed="rId27"/>
+                    <a:stretch>
+                      <a:fillRect/>
+                    </a:stretch>
+                  </pic:blipFill>
+                  <pic:spPr>
+                    <a:xfrm>
+                      <a:off x="0" y="0"/>
+                      <a:ext cx="5989320" cy="3144393"/>
+                    </a:xfrm>
+                    <a:prstGeom prst="rect"/>
+                  </pic:spPr>
+                </pic:pic>
+              </a:graphicData>
+            </a:graphic>
+          </wp:inline>
+        </w:drawing>
+      </w:r>
+    </w:p>
+    <w:p>
+      <w:pPr>
+        <w:jc w:val="center"/>
+      </w:pPr>
+      <w:r>
+        <w:rPr>
+          <w:i/>
+          <w:color w:val="64777A"/>
+        </w:rPr>
+        <w:t>Figure: provenance → relation → policy action → resulting state. Teaching illustration only; not evidence or a model of actual named agents.</w:t>
+      </w:r>
+    </w:p>
+    <w:p>
+      <w:pPr>
+        <w:pStyle w:val="Heading2"/>
+      </w:pPr>
+      <w:r>
+        <w:t>How to explain the four separate questions</w:t>
+      </w:r>
+    </w:p>
+    <w:p>
+      <w:pPr>
+        <w:pStyle w:val="ListBullet"/>
+      </w:pPr>
+      <w:r>
+        <w:rPr>
+          <w:b/>
+        </w:rPr>
+        <w:t xml:space="preserve">1. Provenance — who supplied which claim? </w:t>
+      </w:r>
+      <w:r>
+        <w:t>Keep each assertion attached to its hypothetical label and event metadata. A label alone is not a reliability score.</w:t>
+      </w:r>
+    </w:p>
+    <w:p>
+      <w:pPr>
+        <w:pStyle w:val="ListBullet"/>
+      </w:pPr>
+      <w:r>
+        <w:rPr>
+          <w:b/>
+        </w:rPr>
+        <w:t xml:space="preserve">2. Relation — can the claims coexist? </w:t>
+      </w:r>
+      <w:r>
+        <w:t>With the key, role, interval and cardinality held fixed, equal normalized values can be treated as equivalent candidates; PostgreSQL versus DynamoDB is a hard-conflict candidate. If those scope fields differ, do not call it a same-key conflict.</w:t>
+      </w:r>
+    </w:p>
+    <w:p>
+      <w:pPr>
+        <w:pStyle w:val="ListBullet"/>
+      </w:pPr>
+      <w:r>
+        <w:rPr>
+          <w:b/>
+        </w:rPr>
+        <w:t xml:space="preserve">3. Policy action — what should the system do? </w:t>
+      </w:r>
+      <w:r>
+        <w:t>The example chooses Verify as a proposed action because claims disagree. Verify is not a result; its evidence source and decision rule must be specified before any conclusion.</w:t>
+      </w:r>
+    </w:p>
+    <w:p>
+      <w:pPr>
+        <w:pStyle w:val="ListBullet"/>
+      </w:pPr>
+      <w:r>
+        <w:rPr>
+          <w:b/>
+        </w:rPr>
+        <w:t xml:space="preserve">4. Result — what state is published? </w:t>
+      </w:r>
+      <w:r>
+        <w:t>No shared authoritative evidence is supplied in the example, so the safe demonstration outcome is UNRESOLVED with both candidate values and provenance retained. It does not guess which database is correct.</w:t>
+      </w:r>
+    </w:p>
+    <w:p>
+      <w:r>
+        <w:br w:type="page"/>
+      </w:r>
+    </w:p>
+    <w:p>
+      <w:pPr>
+        <w:pStyle w:val="Heading1"/>
+      </w:pPr>
+      <w:r>
+        <w:t>Extra review points to make the proposal stronger</w:t>
+      </w:r>
+    </w:p>
+    <w:p>
+      <w:pPr/>
+      <w:r>
+        <w:t>1. State the key contract first. Name the key type, value domain, scope, temporal interval and cardinality. Make every pair either genuinely same-key or explicitly a control. This prevents a role mismatch from being mislabeled as a conflict.</w:t>
+      </w:r>
+    </w:p>
+    <w:p>
+      <w:pPr/>
+      <w:r>
+        <w:t>2. Separate four layers. Keep agent/event provenance, gold relation label, policy action (Agree/Verify/Abstain), and final state (resolved value or UNRESOLVED) as separate fields. This makes errors diagnosable.</w:t>
+      </w:r>
+    </w:p>
+    <w:p>
+      <w:pPr/>
+      <w:r>
+        <w:t>3. Give Verify a bounded job. Name the permitted evidence, freshness rule, conflict tie behavior and deterministic decision procedure. If evidence is missing or contradictory, preserve UNRESOLVED rather than inventing certainty.</w:t>
+      </w:r>
+    </w:p>
+    <w:p>
+      <w:pPr/>
+      <w:r>
+        <w:t>4. Make comparisons fair. Use the same pair, context, evidence, prompt budget and evaluation split across arms where applicable. Report classifier quality apart from policy outcomes; compare the deterministic and preserve/abstain baselines directly.</w:t>
+      </w:r>
+    </w:p>
+    <w:p>
+      <w:pPr/>
+      <w:r>
+        <w:t>5. Measure safety and usefulness separately. Report false merges on real conflicts, false conflicts on resolvable pairs, unnecessary abstentions, class-wise scores, calibration, latency and cost. Avoid a single score that hides safety trade-offs.</w:t>
+      </w:r>
+    </w:p>
+    <w:p>
+      <w:pPr/>
+      <w:r>
+        <w:t>6. Keep the scope feasible. Seven methods plus annotation, calibration and distributed simulation is ambitious for an M.E. First decide the research gate and a small reproducible core; make simulator scale-up conditional, not assumed.</w:t>
+      </w:r>
+    </w:p>
+    <w:p>
+      <w:pPr>
+        <w:pStyle w:val="Heading1"/>
+      </w:pPr>
+      <w:r>
+        <w:t>Questions a reviewer may ask — concise answers</w:t>
+      </w:r>
+    </w:p>
+    <w:p>
+      <w:r>
+        <w:rPr>
+          <w:b/>
+        </w:rPr>
+        <w:t>Why use a team of agents rather than one assistant?</w:t>
+      </w:r>
+    </w:p>
+    <w:p>
+      <w:pPr>
+        <w:ind w:left="288"/>
+      </w:pPr>
+      <w:r>
+        <w:t>The team is an illustrative setting for independently produced updates to shared state. The research question is about the state decision, not a claim that any named agent is connected or has a particular role.</w:t>
+      </w:r>
+    </w:p>
+    <w:p>
+      <w:r>
+        <w:rPr>
+          <w:b/>
+        </w:rPr>
+        <w:t>Why not always take the newest write?</w:t>
+      </w:r>
+    </w:p>
+    <w:p>
+      <w:pPr>
+        <w:ind w:left="288"/>
+      </w:pPr>
+      <w:r>
+        <w:t>Arrival time may reflect network order rather than truth or validity. Newest-wins is a useful baseline to test, not a default truth rule.</w:t>
+      </w:r>
+    </w:p>
+    <w:p>
+      <w:r>
+        <w:rPr>
+          <w:b/>
+        </w:rPr>
+        <w:t>Does Verify guarantee correctness?</w:t>
+      </w:r>
+    </w:p>
+    <w:p>
+      <w:pPr>
+        <w:ind w:left="288"/>
+      </w:pPr>
+      <w:r>
+        <w:t>No. It can only use specified evidence and rules. Without adequate evidence, it should abstain or leave the key unresolved.</w:t>
+      </w:r>
+    </w:p>
+    <w:p>
+      <w:r>
+        <w:rPr>
+          <w:b/>
+        </w:rPr>
+        <w:t>Does this prove all replicas converge?</w:t>
+      </w:r>
+    </w:p>
+    <w:p>
+      <w:pPr>
+        <w:ind w:left="288"/>
+      </w:pPr>
+      <w:r>
+        <w:t>No. Convergence is a target condition. The event set, canonicalization, resolver determinism and exact meaning of projected state still need definition and verification.</w:t>
+      </w:r>
+    </w:p>
+    <w:p>
+      <w:r>
+        <w:rPr>
+          <w:b/>
+        </w:rPr>
+        <w:t>Is the novelty established?</w:t>
+      </w:r>
+    </w:p>
+    <w:p>
+      <w:pPr>
+        <w:ind w:left="288"/>
+      </w:pPr>
+      <w:r>
+        <w:t>No. Pass 3 remains incomplete and prior work overlaps with several parts of the proposal. The candidate gap must survive source-wide review and active disconfirmation.</w:t>
+      </w:r>
+    </w:p>
+    <w:p>
+      <w:pPr>
+        <w:keepNext/>
+      </w:pPr>
+      <w:r>
+        <w:rPr>
+          <w:b/>
+        </w:rPr>
+        <w:t>What do the six agent names mean?</w:t>
+      </w:r>
+    </w:p>
+    <w:p>
+      <w:pPr>
+        <w:keepLines/>
+        <w:ind w:left="288"/>
+      </w:pPr>
+      <w:r>
+        <w:t>They are user-supplied hypothetical labels for the teaching scenario only. The example assigns no actual identity, capability, integration, role or performance to them.</w:t>
+      </w:r>
+    </w:p>
+    <w:p>
+      <w:r>
+        <w:br w:type="page"/>
+      </w:r>
+    </w:p>
+    <w:p>
+      <w:pPr>
+        <w:pStyle w:val="Heading1"/>
+      </w:pPr>
+      <w:r>
+        <w:t>Monday 26 October review: presentation plan</w:t>
+      </w:r>
+    </w:p>
+    <w:p>
+      <w:r>
+        <w:t>Use this as a practical rehearsal checklist for Monday. The review start time and official college module labels were not supplied, so this pack keeps its eight module headings provisional and does not invent a schedule.</w:t>
+      </w:r>
+    </w:p>
+    <w:p>
+      <w:pPr>
+        <w:pStyle w:val="Heading2"/>
+      </w:pPr>
+      <w:r>
+        <w:t>Opening talk track (about 90 seconds)</w:t>
+      </w:r>
+    </w:p>
+    <w:p>
+      <w:pPr>
+        <w:ind w:left="259" w:right="259"/>
+      </w:pPr>
+      <w:r>
+        <w:t>“My proposal studies a narrow shared-state problem in multi-agent AI: several agents may update one key, but receiving all events does not guarantee that the published meaning is safe. I define the key and scope first, classify the assertion relationship, then compare Agree, Verify and Abstain policies. For example, six hypothetical agent labels can write different values for one explicitly defined database key; if evidence does not settle the disagreement, the result stays UNRESOLVED with provenance preserved. I will measure unsafe merges, missed safe resolutions, unnecessary abstention, calibration and cost, and only then consider a minimal asynchronous simulator. Existing work overlaps with important parts of this proposal, so novelty is not established; the Pass 3 literature gate is still open. Today I’m seeking feedback on the key schema, label definitions and feasible scope—not presenting results or a completed implementation.”</w:t>
+      </w:r>
+    </w:p>
+    <w:p>
+      <w:pPr>
+        <w:pStyle w:val="Heading2"/>
+      </w:pPr>
+      <w:r>
+        <w:t>Before you present</w:t>
+      </w:r>
+    </w:p>
+    <w:p>
+      <w:pPr>
+        <w:pStyle w:val="ListBullet"/>
+      </w:pPr>
+      <w:r>
+        <w:t>Open the PDF slide deck once; confirm the slide order and that fonts/diagrams display on the presentation device.</w:t>
+      </w:r>
+    </w:p>
+    <w:p>
+      <w:pPr>
+        <w:pStyle w:val="ListBullet"/>
+      </w:pPr>
+      <w:r>
+        <w:t>Keep the editable PPTX and PDF together; bring the report PDF as a reference copy and the editable report only if asked.</w:t>
+      </w:r>
+    </w:p>
+    <w:p>
+      <w:pPr>
+        <w:pStyle w:val="ListBullet"/>
+      </w:pPr>
+      <w:r>
+        <w:t>Rehearse the 90-second opener and the one-key example; point to provenance, relation, policy action, then result in that order.</w:t>
+      </w:r>
+    </w:p>
+    <w:p>
+      <w:pPr>
+        <w:pStyle w:val="ListBullet"/>
+      </w:pPr>
+      <w:r>
+        <w:t>Say “hypothetical example” before using the six agent labels. Do not describe them as connected products or assign them real functions.</w:t>
+      </w:r>
+    </w:p>
+    <w:p>
+      <w:pPr>
+        <w:pStyle w:val="ListBullet"/>
+      </w:pPr>
+      <w:r>
+        <w:t>State the gate honestly: literature review incomplete, novelty unresolved, convergence unproved, no protocol implementation or formal thesis drafting.</w:t>
+      </w:r>
+    </w:p>
+    <w:p>
+      <w:pPr>
+        <w:pStyle w:val="ListBullet"/>
+      </w:pPr>
+      <w:r>
+        <w:t>Ask which college module headings/template should replace the provisional eight-part structure, and what the review expects next.</w:t>
+      </w:r>
+    </w:p>
+    <w:p>
+      <w:pPr>
+        <w:pStyle w:val="ListBullet"/>
+      </w:pPr>
+      <w:r>
+        <w:t>Write down the supervisor/reviewer’s requested changes and any date they specify; do not assume a milestone or approval from discussion alone.</w:t>
+      </w:r>
+    </w:p>
+    <w:p>
+      <w:pPr>
+        <w:pStyle w:val="Heading2"/>
+      </w:pPr>
+      <w:r>
+        <w:t>Three useful feedback questions for the review</w:t>
+      </w:r>
+    </w:p>
+    <w:p>
+      <w:pPr>
+        <w:pStyle w:val="ListBullet"/>
+      </w:pPr>
+      <w:r>
+        <w:t>Is the same-key contract (key, value type, role, time scope, cardinality) precise enough for the first review?</w:t>
+      </w:r>
+    </w:p>
+    <w:p>
+      <w:pPr>
+        <w:pStyle w:val="ListBullet"/>
+      </w:pPr>
+      <w:r>
+        <w:t>Should the M.E. prioritize relation classification and safety metrics first, with distributed simulation kept minimal or staged?</w:t>
+      </w:r>
+    </w:p>
+    <w:p>
+      <w:pPr>
+        <w:pStyle w:val="ListBullet"/>
+      </w:pPr>
+      <w:r>
+        <w:t>What required literature/design evidence must be completed before the project may move beyond the proposal gate?</w:t>
+      </w:r>
+    </w:p>
+    <w:p>
+      <w:r>
+        <w:rPr>
+          <w:i/>
+          <w:color w:val="64777A"/>
+        </w:rPr>
+        <w:t>Monday-ready additions prepared 22 October 2026. The scenario, agent labels and animal references are teaching aids only; they are not source evidence, system observations or implementation claims.</w:t>
+      </w:r>
+    </w:p>
     <w:sectPr>
       <w:footerReference w:type="default" r:id="rId9"/>
       <w:pgSz w:w="12240" w:h="15840"/>

</xml_diff>

<commit_message>
docs: add AVA literature audit review update
</commit_message>
<xml_diff>
--- a/docs/review-pack/AVA_Evaluation_Review_Report.docx
+++ b/docs/review-pack/AVA_Evaluation_Review_Report.docx
@@ -3108,6 +3108,618 @@
         <w:t>Monday-ready additions prepared 22 October 2026. The scenario, agent labels and animal references are teaching aids only; they are not source evidence, system observations or implementation claims.</w:t>
       </w:r>
     </w:p>
+    <w:p>
+      <w:r>
+        <w:br w:type="page"/>
+      </w:r>
+    </w:p>
+    <w:p>
+      <w:pPr>
+        <w:pStyle w:val="Title"/>
+        <w:jc w:val="center"/>
+      </w:pPr>
+      <w:r>
+        <w:t>Appendix A — Current Primary-Source Audit Notes</w:t>
+      </w:r>
+    </w:p>
+    <w:p>
+      <w:pPr>
+        <w:jc w:val="center"/>
+      </w:pPr>
+      <w:r>
+        <w:rPr>
+          <w:b/>
+          <w:color w:val="964630"/>
+        </w:rPr>
+        <w:t>Prepared 22 October 2026 · evidence checkpoint only · not a final literature verdict</w:t>
+      </w:r>
+    </w:p>
+    <w:p>
+      <w:pPr>
+        <w:pStyle w:val="Heading1"/>
+      </w:pPr>
+      <w:r>
+        <w:t>How to read this appendix</w:t>
+      </w:r>
+    </w:p>
+    <w:p>
+      <w:r>
+        <w:t>These are working notes from targeted primary-source excerpts and selected sections. They preserve reported results and known caveats; they are not independent reproductions, an exhaustive literature census, or an adjudicated novelty decision. A source link/version is not proof that every section or supplement was read. Five required audits—Always-On Agents, StateFuse, TOKI, S-Bus and SCF—still need source-wide and appendix review. No implementation or formal thesis claim is authorized by this appendix.</w:t>
+      </w:r>
+    </w:p>
+    <w:p>
+      <w:r>
+        <w:t>Working question: does AVA’s proposed same-key assertion pipeline—classify a pair, then use evidence-based Verify—add anything beyond fixed-winner and preserve-unresolved policies when delivery is asynchronous? This remains a candidate question, not a demonstrated gap. Compare semantic-state convergence separately from event delivery, status convergence, and downstream retrieval.</w:t>
+      </w:r>
+    </w:p>
+    <w:p>
+      <w:pPr>
+        <w:pStyle w:val="Heading1"/>
+      </w:pPr>
+      <w:r>
+        <w:t>Closest systems and memory-policy comparisons</w:t>
+      </w:r>
+    </w:p>
+    <w:p>
+      <w:pPr>
+        <w:pStyle w:val="Heading2"/>
+      </w:pPr>
+      <w:r>
+        <w:t>MELD — A Protocol for Merging Knowledge Across Distributed Agentic Memories (arXiv:2608.16357v1)</w:t>
+      </w:r>
+    </w:p>
+    <w:p>
+      <w:r>
+        <w:t xml:space="preserve">Primary source — </w:t>
+      </w:r>
+      <w:hyperlink r:id="rId15">
+        <w:r>
+          <w:rPr>
+            <w:color w:val="167D9A"/>
+            <w:u w:val="single"/>
+          </w:rPr>
+          <w:t>https://arxiv.org/html/2608.16357v1</w:t>
+        </w:r>
+      </w:hyperlink>
+    </w:p>
+    <w:p>
+      <w:r>
+        <w:t>The 104-pair benchmark deliberately uses distinct claim keys, so it is not a strict same-key pair test. Its status CRDT converges after healing, but the merge graph/live claim set/retrieval view can remain order-sensitive: Appendix M reports 177 joint graph fingerprints across 200 orderings and different live sets in 112/200. Earlier checked findings: 26 seeds × four classes; classifier macro-F1 .845 (95% CI .766–.912), AUC .968 and FMR 1/78. This is close relation-label/convergence prior art, but does not settle AVA’s same-key policy comparison. Reading remains selected, not source-wide.</w:t>
+      </w:r>
+    </w:p>
+    <w:p>
+      <w:pPr>
+        <w:pStyle w:val="Heading2"/>
+      </w:pPr>
+      <w:r>
+        <w:t>MemTX — Transactional Belief Commit for Stateful Agent Memory (arXiv:2607.23929v2)</w:t>
+      </w:r>
+    </w:p>
+    <w:p>
+      <w:r>
+        <w:t xml:space="preserve">Primary source — </w:t>
+      </w:r>
+      <w:hyperlink r:id="rId28">
+        <w:r>
+          <w:rPr>
+            <w:color w:val="167D9A"/>
+            <w:u w:val="single"/>
+          </w:rPr>
+          <w:t>https://arxiv.org/html/2607.23929v2</w:t>
+        </w:r>
+      </w:hyperlink>
+    </w:p>
+    <w:p>
+      <w:r>
+        <w:t>Evidence-, permission-, provenance- and validity-bearing records are staged under snapshot isolation and admitted through validate-and-commit; a rule-based semantic-conflict check handles the same entity/attribute slot. The paper reports a 90-case main suite across five backbones and bounded checking over about 5.5 million states. Cases use 1–3 agents (median 2) and interleaved turns over one shared store. This is close semantic commit/conflict work, not evidence of decentralized asynchronous replica convergence.</w:t>
+      </w:r>
+    </w:p>
+    <w:p>
+      <w:pPr>
+        <w:pStyle w:val="Heading2"/>
+      </w:pPr>
+      <w:r>
+        <w:t>TARL — Transaction-Aware Reliable Ledgers for Executable Memory Management (arXiv:2608.03699v5)</w:t>
+      </w:r>
+    </w:p>
+    <w:p>
+      <w:r>
+        <w:t xml:space="preserve">Primary source — </w:t>
+      </w:r>
+      <w:hyperlink r:id="rId29">
+        <w:r>
+          <w:rPr>
+            <w:color w:val="167D9A"/>
+            <w:u w:val="single"/>
+          </w:rPr>
+          <w:t>https://arxiv.org/html/2608.03699v5</w:t>
+        </w:r>
+      </w:hyperlink>
+    </w:p>
+    <w:p>
+      <w:r>
+        <w:t>Its five actions are append, noop, revise, reject_conflict and defer_verify; Pending and Rejected are distinct destinations. TARL-Mem contains 5,422 cases and includes exact gold next-state behavior, state recovery, conflict preservation, temporal handling and sequential rollout. This directly overlaps deferral vs rejection and fine-grained transaction policy; the checked material does not evaluate asynchronous distributed replication or convergence.</w:t>
+      </w:r>
+    </w:p>
+    <w:p>
+      <w:pPr>
+        <w:pStyle w:val="Heading2"/>
+      </w:pPr>
+      <w:r>
+        <w:t>LatticeMind — A Conflict-Aware Memory Primitive for Multi-Agent Systems (arXiv:2608.08236v1)</w:t>
+      </w:r>
+    </w:p>
+    <w:p>
+      <w:r>
+        <w:t xml:space="preserve">Primary source — </w:t>
+      </w:r>
+      <w:hyperlink r:id="rId30">
+        <w:r>
+          <w:rPr>
+            <w:color w:val="167D9A"/>
+            <w:u w:val="single"/>
+          </w:rPr>
+          <w:t>https://arxiv.org/html/2608.08236v1</w:t>
+        </w:r>
+      </w:hyperlink>
+    </w:p>
+    <w:p>
+      <w:r>
+        <w:t>Routes keyed claims and classifies semantic conflicts as Credibility or Coordination before reconciliation. On 75 label-blind ConflictBank examples with Qwen3-Max, it reports 73/75 (0.97), versus 0.61 for the strongest aggregation baseline. The benchmark is small and the inspected evaluation uses centralized/item-state handling; no asynchronous writer/convergence result was found. Strong overlap for classify-then-reconcile, not proof of AVA-specific preemption.</w:t>
+      </w:r>
+    </w:p>
+    <w:p>
+      <w:pPr>
+        <w:pStyle w:val="Heading2"/>
+      </w:pPr>
+      <w:r>
+        <w:t>StateFuse — Deterministic Conflict-Preserving Memory for Multi-Agent Systems (arXiv:2607.05844v1)</w:t>
+      </w:r>
+    </w:p>
+    <w:p>
+      <w:r>
+        <w:t xml:space="preserve">Primary source — </w:t>
+      </w:r>
+      <w:hyperlink r:id="rId16">
+        <w:r>
+          <w:rPr>
+            <w:color w:val="167D9A"/>
+            <w:u w:val="single"/>
+          </w:rPr>
+          <w:t>https://arxiv.org/html/2607.05844v1</w:t>
+        </w:r>
+      </w:hyperlink>
+    </w:p>
+    <w:p>
+      <w:r>
+        <w:t>Uses replicated CRDT state with explicit conflicts, provenance/correction handles and projection-time selection or abstention without mutating the base state. For the same 282-question benchmark, Table 3 reports 64.9% accuracy, while prose reports 97.5%; the discrepancy is unresolved, so neither figure is selected as authoritative. The paper also includes a controlled downstream verification loop, but the exact Table 4 numeric values were not recovered. Source-wide and appendix checks remain due.</w:t>
+      </w:r>
+    </w:p>
+    <w:p>
+      <w:pPr>
+        <w:pStyle w:val="Heading2"/>
+      </w:pPr>
+      <w:r>
+        <w:t>TOKI — A Bitemporal Operator Algebra for Contradiction Resolution in LLM-Agent Persistent Memory (arXiv:2606.06240v1)</w:t>
+      </w:r>
+    </w:p>
+    <w:p>
+      <w:r>
+        <w:t xml:space="preserve">Primary source — </w:t>
+      </w:r>
+      <w:hyperlink r:id="rId17">
+        <w:r>
+          <w:rPr>
+            <w:color w:val="167D9A"/>
+            <w:u w:val="single"/>
+          </w:rPr>
+          <w:t>https://arxiv.org/html/2606.06240v1</w:t>
+        </w:r>
+      </w:hyperlink>
+    </w:p>
+    <w:p>
+      <w:r>
+        <w:t>Typed operators handle same-subject/predicate conflicts with time and provenance; the compared modes include last-write-wins, evidence, await-confirmation and per-rule policies. The paper’s PostgreSQL multiwriter test is single-node; it makes no distributed deployment claim. This is strong overlap for evidence/time-aware resolution and confirmation, but not AVA’s asynchronous convergence test.</w:t>
+      </w:r>
+    </w:p>
+    <w:p>
+      <w:pPr>
+        <w:pStyle w:val="Heading2"/>
+      </w:pPr>
+      <w:r>
+        <w:t>CoAgent — Concurrency Control for Multi-Agent Systems (arXiv:2606.15376v1)</w:t>
+      </w:r>
+    </w:p>
+    <w:p>
+      <w:r>
+        <w:t xml:space="preserve">Primary source — </w:t>
+      </w:r>
+      <w:hyperlink r:id="rId31">
+        <w:r>
+          <w:rPr>
+            <w:color w:val="167D9A"/>
+            <w:u w:val="single"/>
+          </w:rPr>
+          <w:t>https://arxiv.org/html/2606.15376v1</w:t>
+        </w:r>
+      </w:hyperlink>
+    </w:p>
+    <w:p>
+      <w:r>
+        <w:t>An LLM judges whether a concurrent write invalidates its plan and repairs affected actions. Serializability at quiescence depends on stated protocol assumptions, including correct relevance judgments; authors report 5% misjudgment in their tested setting. This is plan-validity repair, not adjudicating which same-key assertion is true.</w:t>
+      </w:r>
+    </w:p>
+    <w:p>
+      <w:pPr>
+        <w:pStyle w:val="Heading2"/>
+      </w:pPr>
+      <w:r>
+        <w:t>Governed Shared Memory for Multi-Agent LLM Systems (arXiv:2606.24535v1)</w:t>
+      </w:r>
+    </w:p>
+    <w:p>
+      <w:r>
+        <w:t xml:space="preserve">Primary source — </w:t>
+      </w:r>
+      <w:hyperlink r:id="rId22">
+        <w:r>
+          <w:rPr>
+            <w:color w:val="167D9A"/>
+            <w:u w:val="single"/>
+          </w:rPr>
+          <w:t>https://arxiv.org/html/2606.24535v1</w:t>
+        </w:r>
+      </w:hyperlink>
+    </w:p>
+    <w:p>
+      <w:r>
+        <w:t>Reports post-commit asynchronous contradiction supersession in 90/90 runs conditional on both writes being admitted; overall it is 98/200 because a synchronous dedup gate rejected 206/400 writes before the asynchronous detector saw them. This is the closest direct asynchronous shared-memory evidence found and shows why admission effects belong in end-to-end metrics. It does not establish AVA’s verifier novelty.</w:t>
+      </w:r>
+    </w:p>
+    <w:p>
+      <w:pPr>
+        <w:pStyle w:val="Heading2"/>
+      </w:pPr>
+      <w:r>
+        <w:t>S-Bus — Automatic Read-Set Reconstruction for Multi-Agent LLM State Coordination (arXiv:2605.17076v2)</w:t>
+      </w:r>
+    </w:p>
+    <w:p>
+      <w:r>
+        <w:t xml:space="preserve">Primary source — </w:t>
+      </w:r>
+      <w:hyperlink r:id="rId19">
+        <w:r>
+          <w:rPr>
+            <w:color w:val="167D9A"/>
+            <w:u w:val="single"/>
+          </w:rPr>
+          <w:t>https://arxiv.org/html/2605.17076v2</w:t>
+        </w:r>
+      </w:hyperlink>
+    </w:p>
+    <w:p>
+      <w:r>
+        <w:t>Structural optimistic concurrency control (OCC) baseline. In the experiment-merge comparison, 45/45 structural conflicts were rejected and retry success was 100%; it is not semantic assertion verification. Distinguish this structural guarantee from semantic conflict resolution and convergence. Full appendix audit remains open.</w:t>
+      </w:r>
+    </w:p>
+    <w:p>
+      <w:pPr>
+        <w:pStyle w:val="Heading2"/>
+      </w:pPr>
+      <w:r>
+        <w:t>Semantic Consensus / SCF — Process-Aware Conflict Detection and Resolution for Enterprise Multi-Agent LLM Systems (arXiv:2604.16339v1)</w:t>
+      </w:r>
+    </w:p>
+    <w:p>
+      <w:r>
+        <w:t xml:space="preserve">Primary source — </w:t>
+      </w:r>
+      <w:hyperlink r:id="rId20">
+        <w:r>
+          <w:rPr>
+            <w:color w:val="167D9A"/>
+            <w:u w:val="single"/>
+          </w:rPr>
+          <w:t>https://arxiv.org/html/2604.16339v1</w:t>
+        </w:r>
+      </w:hyperlink>
+    </w:p>
+    <w:p>
+      <w:r>
+        <w:t>Detects workflow-intent conflicts before execution, not replicated claim truth. Across 600 simulated runs it reports 27.9% precision, 65.2% recall, 39.0% F1 and 100% workflow completion; the setting covers 4–6 agents. The +10.8/+21 percentage-point result in the related evidence is whole-pipeline, not isolated policy gain; on LongMemEval the isolated policy comparison is 26/45 vs 29/45, p=.45. Live distributed convergence is not shown. The full primary paper and source-wide appendices still need review.</w:t>
+      </w:r>
+    </w:p>
+    <w:p>
+      <w:pPr>
+        <w:pStyle w:val="Heading2"/>
+      </w:pPr>
+      <w:r>
+        <w:t>Always-On Agents survey (arXiv:2606.30306v1)</w:t>
+      </w:r>
+    </w:p>
+    <w:p>
+      <w:r>
+        <w:t xml:space="preserve">Primary source — </w:t>
+      </w:r>
+      <w:hyperlink r:id="rId32">
+        <w:r>
+          <w:rPr>
+            <w:color w:val="167D9A"/>
+            <w:u w:val="single"/>
+          </w:rPr>
+          <w:t>https://arxiv.org/html/2606.30306v1</w:t>
+        </w:r>
+      </w:hyperlink>
+    </w:p>
+    <w:p>
+      <w:r>
+        <w:t>A scoped, non-exhaustive map of 435 works; it treats validation as an underdeveloped lifecycle stage. A survey’s gap map is not proof that no specific prior work exists. The survey-wide references and appendices have not been checked end-to-end.</w:t>
+      </w:r>
+    </w:p>
+    <w:p>
+      <w:pPr>
+        <w:pStyle w:val="Heading2"/>
+      </w:pPr>
+      <w:r>
+        <w:t>CodeCRDT — Observation-Driven Coordination for Multi-Agent LLM Code Generation (arXiv:2510.18893v1)</w:t>
+      </w:r>
+    </w:p>
+    <w:p>
+      <w:r>
+        <w:t xml:space="preserve">Primary source — </w:t>
+      </w:r>
+      <w:hyperlink r:id="rId21">
+        <w:r>
+          <w:rPr>
+            <w:color w:val="167D9A"/>
+            <w:u w:val="single"/>
+          </w:rPr>
+          <w:t>https://arxiv.org/html/2510.18893v1</w:t>
+        </w:r>
+      </w:hyperlink>
+    </w:p>
+    <w:p>
+      <w:r>
+        <w:t>The often-cited 5–10% semantic-conflict rate is a preliminary manual estimate from 60/600 runs, not a fully measured population result. It distinguishes mechanical convergence from semantic quality but is not a same-key assertion benchmark.</w:t>
+      </w:r>
+    </w:p>
+    <w:p>
+      <w:pPr>
+        <w:pStyle w:val="Heading2"/>
+      </w:pPr>
+      <w:r>
+        <w:t>SubtleMemory v3 (arXiv:2606.05761v3)</w:t>
+      </w:r>
+    </w:p>
+    <w:p>
+      <w:r>
+        <w:t xml:space="preserve">Primary source — </w:t>
+      </w:r>
+      <w:hyperlink r:id="rId18">
+        <w:r>
+          <w:rPr>
+            <w:color w:val="167D9A"/>
+            <w:u w:val="single"/>
+          </w:rPr>
+          <w:t>https://arxiv.org/html/2606.05761v3</w:t>
+        </w:r>
+      </w:hyperlink>
+    </w:p>
+    <w:p>
+      <w:r>
+        <w:t>Relational long-history downstream QA with complementary/nuanced/contradictory cases. It is not isolated same-key pair classification or asynchronous state convergence. It narrows broad relation-sensitive memory-evaluation claims, not the exact AVA systems question.</w:t>
+      </w:r>
+    </w:p>
+    <w:p>
+      <w:pPr>
+        <w:pStyle w:val="Heading1"/>
+      </w:pPr>
+      <w:r>
+        <w:t>NLI, evidence verification and selective-prediction stress tests</w:t>
+      </w:r>
+    </w:p>
+    <w:p>
+      <w:pPr>
+        <w:pStyle w:val="Heading2"/>
+      </w:pPr>
+      <w:r>
+        <w:t>ECon — On the Detection and Resolution of Evidence Conflicts (arXiv:2410.04068v1)</w:t>
+      </w:r>
+    </w:p>
+    <w:p>
+      <w:r>
+        <w:t xml:space="preserve">Primary source — </w:t>
+      </w:r>
+      <w:hyperlink r:id="rId24">
+        <w:r>
+          <w:rPr>
+            <w:color w:val="167D9A"/>
+            <w:u w:val="single"/>
+          </w:rPr>
+          <w:t>https://arxiv.org/html/2410.04068v1</w:t>
+        </w:r>
+      </w:hyperlink>
+    </w:p>
+    <w:p>
+      <w:r>
+        <w:t>Studies question-conditioned answer/factoid evidence-pair conflicts. Its reported pattern is that NLI and LLM detectors can have high precision while weaker models miss conflicts; resolution can be unjustified or rely on the model’s prior knowledge. This is verifier stress evidence, not a concurrent shared-state protocol. Full result-table reconciliation remains open.</w:t>
+      </w:r>
+    </w:p>
+    <w:p>
+      <w:pPr>
+        <w:pStyle w:val="Heading2"/>
+      </w:pPr>
+      <w:r>
+        <w:t>REF-NLI — On Reference (In-)Determinacy in Natural Language Inference (Findings of NAACL 2025)</w:t>
+      </w:r>
+    </w:p>
+    <w:p>
+      <w:r>
+        <w:t xml:space="preserve">Primary source — </w:t>
+      </w:r>
+      <w:hyperlink r:id="rId33">
+        <w:r>
+          <w:rPr>
+            <w:color w:val="167D9A"/>
+            <w:u w:val="single"/>
+          </w:rPr>
+          <w:t>https://aclanthology.org/2025.findings-naacl.450/</w:t>
+        </w:r>
+      </w:hyperlink>
+    </w:p>
+    <w:p>
+      <w:r>
+        <w:t>Its 1,143 claim/evidence pairs include ambiguous references and context mismatch. This warns that a verifier may call claims contradictory when their referents or contexts do not align. It is an annotation/robustness resource, not distributed state resolution.</w:t>
+      </w:r>
+    </w:p>
+    <w:p>
+      <w:pPr>
+        <w:pStyle w:val="Heading2"/>
+      </w:pPr>
+      <w:r>
+        <w:t>ANLI v2 — Adversarial NLI (arXiv:1910.14599v2)</w:t>
+      </w:r>
+    </w:p>
+    <w:p>
+      <w:r>
+        <w:t xml:space="preserve">Primary source — </w:t>
+      </w:r>
+      <w:hyperlink r:id="rId34">
+        <w:r>
+          <w:rPr>
+            <w:color w:val="167D9A"/>
+            <w:u w:val="single"/>
+          </w:rPr>
+          <w:t>https://arxiv.org/html/1910.14599v2</w:t>
+        </w:r>
+      </w:hyperlink>
+    </w:p>
+    <w:p>
+      <w:r>
+        <w:t>Three adversarial rounds contain roughly 19k, 47k and 103k examples. Dev/test examples were human-verified; the paper says training examples were not all individually verified. Useful for stress-testing NLI components, not evidence of memory-policy novelty.</w:t>
+      </w:r>
+    </w:p>
+    <w:p>
+      <w:pPr>
+        <w:pStyle w:val="Heading2"/>
+      </w:pPr>
+      <w:r>
+        <w:t>Varshney, Mishra &amp; Baral — Investigating Selective Prediction Approaches Across Several Tasks in IID, OOD, and Adversarial Settings (arXiv:2203.00211v1)</w:t>
+      </w:r>
+    </w:p>
+    <w:p>
+      <w:r>
+        <w:t xml:space="preserve">Primary source — </w:t>
+      </w:r>
+      <w:hyperlink r:id="rId35">
+        <w:r>
+          <w:rPr>
+            <w:color w:val="167D9A"/>
+            <w:u w:val="single"/>
+          </w:rPr>
+          <w:t>https://arxiv.org/abs/2203.00211</w:t>
+        </w:r>
+      </w:hyperlink>
+    </w:p>
+    <w:p>
+      <w:r>
+        <w:t>The supplied eight-page PDF was read. Across 17 datasets spanning NLI, duplicate detection and QA, it evaluates risk–coverage selective prediction. No method consistently and considerably beats MaxProb across IID, OOD and adversarial settings; performance varies by task and degrades on adversarial cases. Abstention/confidence alone is not evidence verification and needs task-matched evaluation.</w:t>
+      </w:r>
+    </w:p>
+    <w:p>
+      <w:pPr>
+        <w:pStyle w:val="Heading1"/>
+      </w:pPr>
+      <w:r>
+        <w:t>What the evidence supports — and does not</w:t>
+      </w:r>
+    </w:p>
+    <w:p>
+      <w:pPr>
+        <w:pStyle w:val="ListBullet"/>
+      </w:pPr>
+      <w:r>
+        <w:t>Unsafe broad claims: that conflict classification, evidence-aware handling, deferral, abstention, conflict-preserving state, or asynchronous supersession alone is new.</w:t>
+      </w:r>
+    </w:p>
+    <w:p>
+      <w:pPr>
+        <w:pStyle w:val="ListBullet"/>
+      </w:pPr>
+      <w:r>
+        <w:t>Still open: whether the exact combination of same-key relation classification plus an evidence-based Verify policy, compared fairly with fixed-winner and preserve-unresolved baselines under asynchronous delivery and order/convergence metrics, survives direct prior-art comparison. Novelty is not established.</w:t>
+      </w:r>
+    </w:p>
+    <w:p>
+      <w:pPr>
+        <w:pStyle w:val="ListBullet"/>
+      </w:pPr>
+      <w:r>
+        <w:t>Measure the object of convergence explicitly: event set, status flags, active assertion set, conflict graph, resolved projection, and downstream retrieval can behave differently. Report admission/rejection separately from detector performance.</w:t>
+      </w:r>
+    </w:p>
+    <w:p>
+      <w:pPr>
+        <w:pStyle w:val="ListBullet"/>
+      </w:pPr>
+      <w:r>
+        <w:t>Verifier risks: context/reference mismatch, unsupported evidence, prior-informed resolution, task-specific calibration, and over-abstention. Include ambiguous/unknown cases and separate classification results from policy outcomes.</w:t>
+      </w:r>
+    </w:p>
+    <w:p>
+      <w:pPr>
+        <w:pStyle w:val="Heading1"/>
+      </w:pPr>
+      <w:r>
+        <w:t>Outstanding gate items</w:t>
+      </w:r>
+    </w:p>
+    <w:p>
+      <w:pPr>
+        <w:pStyle w:val="ListBullet"/>
+      </w:pPr>
+      <w:r>
+        <w:t>Complete source-wide and appendix/supplement audits for Always-On Agents, StateFuse, TOKI, S-Bus and SCF; record exact sections actually read and resolve relevant version differences.</w:t>
+      </w:r>
+    </w:p>
+    <w:p>
+      <w:pPr>
+        <w:pStyle w:val="ListBullet"/>
+      </w:pPr>
+      <w:r>
+        <w:t>Reconcile StateFuse v1’s 64.9% Table 3 result against the prose 97.5% claim; recover the full controlled-loop table before citing its metrics.</w:t>
+      </w:r>
+    </w:p>
+    <w:p>
+      <w:pPr>
+        <w:pStyle w:val="ListBullet"/>
+      </w:pPr>
+      <w:r>
+        <w:t>Finish the close-prior-art comparison and source-wide NLI/contradiction/selective-prediction pass; inspect the full ECon and related evidence tables. No independent reproduction has been performed.</w:t>
+      </w:r>
+    </w:p>
+    <w:p>
+      <w:pPr>
+        <w:pStyle w:val="ListBullet"/>
+      </w:pPr>
+      <w:r>
+        <w:t>Get the authoritative exact wording/operational criteria for WH-1, WH-2 and WH-3. They remain undefined here and cannot be tested or paraphrased responsibly.</w:t>
+      </w:r>
+    </w:p>
+    <w:p>
+      <w:pPr>
+        <w:pStyle w:val="ListBullet"/>
+      </w:pPr>
+      <w:r>
+        <w:t>Keep this review pack provisional. This appendix is an evidence checkpoint, not a final literature verdict, formal thesis prose, implementation authorization or proof of convergence.</w:t>
+      </w:r>
+    </w:p>
+    <w:p>
+      <w:r>
+        <w:t>Prepared-file note: additions are current primary-source audit notes for review. PR #2 was already merged before this update request; no repository branch or PR was changed for this appendix.</w:t>
+      </w:r>
+    </w:p>
     <w:sectPr>
       <w:footerReference w:type="default" r:id="rId9"/>
       <w:pgSz w:w="12240" w:h="15840"/>

</xml_diff>

<commit_message>
docs: correct StateFuse audit results
</commit_message>
<xml_diff>
--- a/docs/review-pack/AVA_Evaluation_Review_Report.docx
+++ b/docs/review-pack/AVA_Evaluation_Review_Report.docx
@@ -3292,7 +3292,7 @@
     </w:p>
     <w:p>
       <w:r>
-        <w:t>Uses replicated CRDT state with explicit conflicts, provenance/correction handles and projection-time selection or abstention without mutating the base state. For the same 282-question benchmark, Table 3 reports 64.9% accuracy, while prose reports 97.5%; the discrepancy is unresolved, so neither figure is selected as authoritative. The paper also includes a controlled downstream verification loop, but the exact Table 4 numeric values were not recovered. Source-wide and appendix checks remain due.</w:t>
+        <w:t>Uses replicated CRDT state with explicit conflicts, provenance/correction handles and projection-time selection or abstention without mutating the base state. On the 282-question MemoryAgentBench slice, Table 3 reports separate operating settings: conservative abstention has 64.9% accuracy, 100% conflict recall and 2.1% false certainty; the aggressive/latest-write setting has 97.5% accuracy, 0% conflict recall and 2.5% false certainty. These are not contradictory results. In a separate controlled 50-task loop with a uniform verification budget, the conservative StateFuse surface reports 80% pre-verification and 100% post-verification success, 0% post-verification false certainty and 2.4 average tool calls. This synthetic loop is not a decentralized asynchronous-convergence evaluation. Source-wide and appendix checks remain due.</w:t>
       </w:r>
     </w:p>
     <w:p>
@@ -3688,7 +3688,7 @@
         <w:pStyle w:val="ListBullet"/>
       </w:pPr>
       <w:r>
-        <w:t>Reconcile StateFuse v1’s 64.9% Table 3 result against the prose 97.5% claim; recover the full controlled-loop table before citing its metrics.</w:t>
+        <w:t>Finish the close-prior-art comparison and source-wide NLI/contradiction/selective-prediction pass; inspect the full ECon and related evidence tables. No independent reproduction has been performed.</w:t>
       </w:r>
     </w:p>
     <w:p>
@@ -3696,7 +3696,7 @@
         <w:pStyle w:val="ListBullet"/>
       </w:pPr>
       <w:r>
-        <w:t>Finish the close-prior-art comparison and source-wide NLI/contradiction/selective-prediction pass; inspect the full ECon and related evidence tables. No independent reproduction has been performed.</w:t>
+        <w:t>Get the authoritative exact wording/operational criteria for WH-1, WH-2 and WH-3. They remain undefined here and cannot be tested or paraphrased responsibly.</w:t>
       </w:r>
     </w:p>
     <w:p>
@@ -3704,20 +3704,12 @@
         <w:pStyle w:val="ListBullet"/>
       </w:pPr>
       <w:r>
-        <w:t>Get the authoritative exact wording/operational criteria for WH-1, WH-2 and WH-3. They remain undefined here and cannot be tested or paraphrased responsibly.</w:t>
-      </w:r>
-    </w:p>
-    <w:p>
-      <w:pPr>
-        <w:pStyle w:val="ListBullet"/>
-      </w:pPr>
-      <w:r>
         <w:t>Keep this review pack provisional. This appendix is an evidence checkpoint, not a final literature verdict, formal thesis prose, implementation authorization or proof of convergence.</w:t>
       </w:r>
     </w:p>
     <w:p>
       <w:r>
-        <w:t>Prepared-file note: additions are current primary-source audit notes for review. PR #2 was already merged before this update request; no repository branch or PR was changed for this appendix.</w:t>
+        <w:t>Prepared-file note: these are provisional primary-source audit notes. PR #3 merged the earlier pack into main; this follow-up corrects the StateFuse result interpretation and preserves the open literature gate.</w:t>
       </w:r>
     </w:p>
     <w:sectPr>

</xml_diff>

<commit_message>
docs: record five-source AVA literature audit
</commit_message>
<xml_diff>
--- a/docs/review-pack/AVA_Evaluation_Review_Report.docx
+++ b/docs/review-pack/AVA_Evaluation_Review_Report.docx
@@ -1511,7 +1511,7 @@
     </w:p>
     <w:p>
       <w:r>
-        <w:t>The project remains at the literature and design gate. Pass 3 full-text/source-wide verification is incomplete, the novelty gap is unresolved, the exact WH-1/2/3 definitions are absent from the supplied spec, and convergence is a target rather than a proof. No protocol implementation or formal thesis/paper drafting is authorized yet. This pack is for review discussion only.</w:t>
+        <w:t>The project remains at the literature and design gate. A source-wide primary-text pass across five required papers is now recorded, but overall Pass 3 and level-P verification remain incomplete; wider prior-art/NLI checks and the exact WH-1/2/3 definitions are unresolved, and convergence is a target rather than a proof. No protocol implementation or formal thesis/paper drafting is authorized yet. This pack is for review discussion only.</w:t>
       </w:r>
     </w:p>
     <w:p>
@@ -1527,7 +1527,7 @@
         <w:pStyle w:val="ListBullet"/>
       </w:pPr>
       <w:r>
-        <w:t>Gate 1: finish primary-source and NLI/contradiction review; actively challenge the candidate gap.</w:t>
+        <w:t>Gate 1: integrate the five source-wide audits, finish residual closest-threat/NLI reconciliation, and actively challenge the candidate gap.</w:t>
       </w:r>
     </w:p>
     <w:p>
@@ -3144,7 +3144,7 @@
     </w:p>
     <w:p>
       <w:r>
-        <w:t>These are working notes from targeted primary-source excerpts and selected sections. They preserve reported results and known caveats; they are not independent reproductions, an exhaustive literature census, or an adjudicated novelty decision. A source link/version is not proof that every section or supplement was read. Five required audits—Always-On Agents, StateFuse, TOKI, S-Bus and SCF—still need source-wide and appendix review. No implementation or formal thesis claim is authorized by this appendix.</w:t>
+        <w:t>These notes combine a source-wide primary-text pass for Always-On Agents, StateFuse, TOKI, S-Bus and SCF with selected-section checks of other papers. Exact scope and source limitations are recorded in the Pass 3 matrix; these notes are not independent reproductions, an exhaustive literature census, or an adjudicated novelty decision. Full-text reading does not by itself satisfy the project’s level-P standard. Wider threat/NLI checks and the novelty gate remain open. No implementation or formal thesis claim is authorized by this appendix.</w:t>
       </w:r>
     </w:p>
     <w:p>
@@ -3292,7 +3292,7 @@
     </w:p>
     <w:p>
       <w:r>
-        <w:t>Uses replicated CRDT state with explicit conflicts, provenance/correction handles and projection-time selection or abstention without mutating the base state. On the 282-question MemoryAgentBench slice, Table 3 reports separate operating settings: conservative abstention has 64.9% accuracy, 100% conflict recall and 2.1% false certainty; the aggressive StateFuse setting has 97.5% accuracy, 100% conflict recall and 2.5% false certainty. These are not contradictory results. In a separate controlled 50-task loop with a uniform verification budget, the conservative StateFuse surface reports 80% pre-verification and 100% post-verification success, false certainty falling from 20% to 0%, 2.4 average tool calls and 0.00 average action cost. This synthetic loop is not a decentralized asynchronous-convergence evaluation. Source-wide and appendix checks remain due.</w:t>
+        <w:t>Uses replicated CRDT state with explicit conflicts, provenance/correction handles and projection-time selection or abstention without mutating the base state. On the 282-question MemoryAgentBench slice, Table 3 reports separate operating settings: conservative abstention has 64.9% accuracy, 100% conflict recall and 2.1% false certainty; the aggressive StateFuse setting has 97.5% accuracy, 100% conflict recall and 2.5% false certainty. These are not contradictory results. In a separate controlled 50-task loop with a uniform verification budget, the conservative StateFuse surface reports 80% pre-verification and 100% post-verification success, false certainty falling from 20% to 0%, 2.4 average tool calls and 0.00 average action cost. In Table 4, conservative flat baselines also go from 80% to 100% post-Verify success, while collapsed goes from 40% to 60% and retains 40% post-Verify false confidence. This controlled 50-task loop is not a decentralized asynchronous-convergence evaluation. Main text and Technical Appendix A.1–A.5 were read; per-question outputs and some implementation details are not present in the source page.</w:t>
       </w:r>
     </w:p>
     <w:p>
@@ -3319,7 +3319,7 @@
     </w:p>
     <w:p>
       <w:r>
-        <w:t>Typed operators handle same-subject/predicate conflicts with time and provenance; the compared modes include last-write-wins, evidence, await-confirmation and per-rule policies. The paper’s PostgreSQL multiwriter test is single-node; it makes no distributed deployment claim. This is strong overlap for evidence/time-aware resolution and confirmation, but not AVA’s asynchronous convergence test.</w:t>
+        <w:t>The contradiction rule requires the same subject and predicate, different object, and overlapping valid time. Four operators (LWW, Evidence, AwaitConfirm and PerRule) cover read-committed through serializable policies; they stamp a winner and merged-provenance audit row. Table 19 reports +0.86 on LoCoMo audit rows (n=50, 95% CI [.76,.94]); the 1,444-question answerable-pool ablation is .540 with memory vs .048 without. Table 24 is a single-node PostgreSQL test, not distributed deployment evidence. Main text and Appendices A–H were read; supplied HTML omits references and raw experiment files.</w:t>
       </w:r>
     </w:p>
     <w:p>
@@ -3400,7 +3400,7 @@
     </w:p>
     <w:p>
       <w:r>
-        <w:t>Structural optimistic concurrency control (OCC) baseline. In the experiment-merge comparison, 45/45 structural conflicts were rejected and retry success was 100%; it is not semantic assertion verification. Distinguish this structural guarantee from semantic conflict resolution and convergence. Full appendix audit remains open.</w:t>
+        <w:t>Observable-Read Isolation covers HTTP-observable reads only: Table I reports 26.1% R_obs coverage and 73.9% hidden reads. Table X reports 0/638 divergent commits with ORI vs 590/639 without across 80 trials. Formal proofs cover 687 TLAPS obligations modulo one retained axiom; this is structural stale-read protection, not semantic assertion verification. Main text and Appendix A were read; references are absent from the supplied page.</w:t>
       </w:r>
     </w:p>
     <w:p>
@@ -3427,7 +3427,7 @@
     </w:p>
     <w:p>
       <w:r>
-        <w:t>Detects workflow-intent conflicts before execution, not replicated claim truth. Across 600 simulated runs it reports 27.9% precision, 65.2% recall, 39.0% F1 and 100% workflow completion; the setting covers 4–6 agents. The +10.8/+21 percentage-point result in the related evidence is whole-pipeline, not isolated policy gain; on LongMemEval the isolated policy comparison is 26/45 vs 29/45, p=.45. Live distributed convergence is not shown. The full primary paper and source-wide appendices still need review.</w:t>
+        <w:t>Detects workflow-intent conflicts before execution, not replicated claim truth. Across 600 simulated runs it reports 27.9% precision, 65.2% recall, 39.0% F1 and 100% workflow completion; the setting covers 4–6 agents. The +10.8/+21 percentage-point result in the related evidence is whole-pipeline, not isolated policy gain; on LongMemEval the isolated policy comparison is 26/45 vs 29/45, p=.45. Live distributed convergence is not shown. Main text §§1–8 and four tables were reviewed; no appendices are listed, but bibliography entries are absent from the retrieved HTML.</w:t>
       </w:r>
     </w:p>
     <w:p>
@@ -3454,7 +3454,7 @@
     </w:p>
     <w:p>
       <w:r>
-        <w:t>A scoped, non-exhaustive map of 435 works; it treats validation as an underdeveloped lifecycle stage. A survey’s gap map is not proof that no specific prior work exists. The survey-wide references and appendices have not been checked end-to-end.</w:t>
+        <w:t>A scoped, non-exhaustive map of 435 works. Table 18’s AOEP pilot covers nine fault patterns and seven systems; the governed reducer passes 15/15 obligations and 41/41 negative checks, while no-memory passes 0/15 and 41/41, exposing a vacuous-pass issue. Appendix A reports coder agreement on a 236-work sample (lifecycle .82, κ=.58; state .74, κ=.44; rollback agreement on 11/19 co-flagged works). Read HTML through §12, Appendix A and references; the governance-envelope ablation remains unrun and cited-study data are not all included.</w:t>
       </w:r>
     </w:p>
     <w:p>
@@ -3680,7 +3680,7 @@
         <w:pStyle w:val="ListBullet"/>
       </w:pPr>
       <w:r>
-        <w:t>Complete source-wide and appendix/supplement audits for Always-On Agents, StateFuse, TOKI, S-Bus and SCF; record exact sections actually read and resolve relevant version differences.</w:t>
+        <w:t>Reconcile the five newly completed source-wide audits and the already-read CodeCRDT paper against the project’s level-P standard; retrieve missing bibliography/raw artifacts where material. Continue the broader closest-threat/NLI review and active disconfirmation matrix.</w:t>
       </w:r>
     </w:p>
     <w:p>
@@ -3688,7 +3688,7 @@
         <w:pStyle w:val="ListBullet"/>
       </w:pPr>
       <w:r>
-        <w:t>Finish the close-prior-art comparison and source-wide NLI/contradiction/selective-prediction pass; inspect the full ECon and related evidence tables. No independent reproduction has been performed.</w:t>
+        <w:t>Finish the close-prior-art comparison and remaining NLI/contradiction/selective-prediction checks; reconcile ECon and related evidence tables. No independent reproduction has been performed.</w:t>
       </w:r>
     </w:p>
     <w:p>
@@ -3709,7 +3709,7 @@
     </w:p>
     <w:p>
       <w:r>
-        <w:t>Prepared-file note: these are provisional primary-source audit notes. PR #3 merged the earlier pack into main; this follow-up corrects the StateFuse result interpretation and preserves the open literature gate.</w:t>
+        <w:t>Prepared-file note: these provisional audit notes now record source-wide primary-text coverage for the five required papers. The literature gate remains open; missing artifacts, broader prior-art checks and exact WH-1/2/3 wording are unresolved.</w:t>
       </w:r>
     </w:p>
     <w:sectPr>

</xml_diff>